<commit_message>
added finished guide on rewriting commit history
</commit_message>
<xml_diff>
--- a/Intermediate/WordFileVersions/RewritingHistory.docx
+++ b/Intermediate/WordFileVersions/RewritingHistory.docx
@@ -108,7 +108,13 @@
         </w:numPr>
       </w:pPr>
       <w:r>
-        <w:t>Reorder commits using interactive rebase.</w:t>
+        <w:t xml:space="preserve">Reorder commits </w:t>
+      </w:r>
+      <w:r>
+        <w:t>in commit history</w:t>
+      </w:r>
+      <w:r>
+        <w:t>.</w:t>
       </w:r>
     </w:p>
     <w:p>
@@ -378,23 +384,7 @@
     </w:p>
     <w:p>
       <w:r>
-        <w:t xml:space="preserve">NEVER REWRITE HISTORY THAT OTHER PEOPLE ARE ALREADY DEPENDING ON. This is the most important rule to consider when trying to decide whether rewriting commit history is appropriate. As we know, a commit </w:t>
-      </w:r>
-      <w:proofErr w:type="gramStart"/>
-      <w:r>
-        <w:t>hash</w:t>
-      </w:r>
-      <w:proofErr w:type="gramEnd"/>
-      <w:r>
-        <w:t xml:space="preserve"> </w:t>
-      </w:r>
-      <w:proofErr w:type="gramStart"/>
-      <w:r>
-        <w:t>identifies</w:t>
-      </w:r>
-      <w:proofErr w:type="gramEnd"/>
-      <w:r>
-        <w:t xml:space="preserve"> the </w:t>
+        <w:t xml:space="preserve">NEVER REWRITE HISTORY THAT OTHER PEOPLE ARE ALREADY DEPENDING ON. This is the most important rule to consider when trying to decide whether rewriting commit history is appropriate. As we know, a commit hash identifies the </w:t>
       </w:r>
       <w:r>
         <w:t>content of a commit object</w:t>
@@ -490,15 +480,7 @@
     </w:p>
     <w:p>
       <w:r>
-        <w:t xml:space="preserve">Diverged commit histories become a problem because other teammates may have commits based on the old history, pulling the changes may now require complicated merges, </w:t>
-      </w:r>
-      <w:proofErr w:type="gramStart"/>
-      <w:r>
-        <w:t>and force</w:t>
-      </w:r>
-      <w:proofErr w:type="gramEnd"/>
-      <w:r>
-        <w:t xml:space="preserve"> pushing the changes to the remote repository may overwrite someone else’s work. This is all stuff we want to avoid as it causes unnecessary </w:t>
+        <w:t xml:space="preserve">Diverged commit histories become a problem because other teammates may have commits based on the old history, pulling the changes may now require complicated merges, and force pushing the changes to the remote repository may overwrite someone else’s work. This is all stuff we want to avoid as it causes unnecessary </w:t>
       </w:r>
       <w:r>
         <w:t>chaos that</w:t>
@@ -525,6 +507,35 @@
         <w:pStyle w:val="Heading2"/>
       </w:pPr>
       <w:r>
+        <w:t>Public vs Private Rewrites</w:t>
+      </w:r>
+    </w:p>
+    <w:p>
+      <w:r>
+        <w:t xml:space="preserve">Before we go over how to rewrite history, there is an important distinction that needs to be made. </w:t>
+      </w:r>
+    </w:p>
+    <w:p>
+      <w:r>
+        <w:lastRenderedPageBreak/>
+        <w:t xml:space="preserve">Private history is the history that exists only in your local repository. No other team member can access or depend on these commits until they are pushed to the remote repository. </w:t>
+      </w:r>
+    </w:p>
+    <w:p>
+      <w:r>
+        <w:t>In contrast, public history is the history that exists in your remote repository. This history is shared and can be used by other team members.</w:t>
+      </w:r>
+    </w:p>
+    <w:p>
+      <w:r>
+        <w:t>Typically, these histories are in alignment with each other. However, when you rewrite history you may change the local history, the remote history, or both. When this happens, the histories must be synchronized again.</w:t>
+      </w:r>
+    </w:p>
+    <w:p>
+      <w:pPr>
+        <w:pStyle w:val="Heading2"/>
+      </w:pPr>
+      <w:r>
         <w:t>Methods of Rewriting History</w:t>
       </w:r>
     </w:p>
@@ -535,7 +546,6 @@
     </w:p>
     <w:p>
       <w:r>
-        <w:lastRenderedPageBreak/>
         <w:t>Common methods of rewriting history include:</w:t>
       </w:r>
     </w:p>
@@ -624,28 +634,12 @@
         <w:t>is</w:t>
       </w:r>
       <w:r>
-        <w:t xml:space="preserve"> when you have a typo in your last commit message and would like to fix it, such as “added </w:t>
-      </w:r>
-      <w:proofErr w:type="spellStart"/>
-      <w:r>
-        <w:t>buttns</w:t>
-      </w:r>
-      <w:proofErr w:type="spellEnd"/>
-      <w:r>
-        <w:t xml:space="preserve"> to main web page”.</w:t>
-      </w:r>
-    </w:p>
-    <w:p>
-      <w:r>
-        <w:t xml:space="preserve">To fix this typo, we would use the command `git commit --amend -m “added buttons to main web </w:t>
-      </w:r>
-      <w:proofErr w:type="gramStart"/>
-      <w:r>
-        <w:t>page”`</w:t>
-      </w:r>
-      <w:proofErr w:type="gramEnd"/>
-      <w:r>
-        <w:t>. This will create a new commit</w:t>
+        <w:t xml:space="preserve"> when you have a typo in your last commit message and would like to fix it, such as “added buttns to main web page”.</w:t>
+      </w:r>
+    </w:p>
+    <w:p>
+      <w:r>
+        <w:t>To fix this typo, we would use the command `git commit --amend -m “added buttons to main web page”`. This will create a new commit</w:t>
       </w:r>
       <w:r>
         <w:t xml:space="preserve"> object to replace the old commit object</w:t>
@@ -656,6 +650,9 @@
     </w:p>
     <w:p>
       <w:r>
+        <w:rPr>
+          <w:noProof/>
+        </w:rPr>
         <w:drawing>
           <wp:inline distT="0" distB="0" distL="0" distR="0" wp14:anchorId="06CC55A8" wp14:editId="67FECA6C">
             <wp:extent cx="3820058" cy="724001"/>
@@ -703,6 +700,7 @@
         <w:pStyle w:val="Heading3"/>
       </w:pPr>
       <w:r>
+        <w:lastRenderedPageBreak/>
         <w:t>Squashing Commits</w:t>
       </w:r>
     </w:p>
@@ -783,38 +781,10 @@
     </w:p>
     <w:p>
       <w:r>
-        <w:t>To do this, we will need to use the command `git rebase -</w:t>
-      </w:r>
-      <w:proofErr w:type="spellStart"/>
-      <w:r>
-        <w:t>i</w:t>
-      </w:r>
-      <w:proofErr w:type="spellEnd"/>
-      <w:r>
-        <w:t xml:space="preserve"> HEAD</w:t>
-      </w:r>
-      <w:proofErr w:type="gramStart"/>
-      <w:r>
-        <w:t>~{</w:t>
-      </w:r>
-      <w:proofErr w:type="gramEnd"/>
-      <w:r>
-        <w:t xml:space="preserve">number of commits you want to squash </w:t>
-      </w:r>
-      <w:proofErr w:type="gramStart"/>
-      <w:r>
-        <w:t>together}`</w:t>
-      </w:r>
-      <w:proofErr w:type="gramEnd"/>
-      <w:r>
-        <w:t>. This will open an editor with the last</w:t>
-      </w:r>
-      <w:r>
-        <w:t xml:space="preserve"> n commits where n is the </w:t>
-      </w:r>
-      <w:r>
-        <w:lastRenderedPageBreak/>
-        <w:t>number of you specified</w:t>
+        <w:t>To do this, we will need to use the command `git rebase -i HEAD~{number of commits you want to squash together}`. This will open an editor with the last</w:t>
+      </w:r>
+      <w:r>
+        <w:t xml:space="preserve"> n commits where n is the number of you specified</w:t>
       </w:r>
       <w:r>
         <w:t xml:space="preserve">. </w:t>
@@ -825,6 +795,9 @@
     </w:p>
     <w:p>
       <w:r>
+        <w:rPr>
+          <w:noProof/>
+        </w:rPr>
         <w:drawing>
           <wp:inline distT="0" distB="0" distL="0" distR="0" wp14:anchorId="13A4E834" wp14:editId="386CC684">
             <wp:extent cx="4934639" cy="1505160"/>
@@ -864,24 +837,15 @@
     </w:p>
     <w:p>
       <w:r>
-        <w:t xml:space="preserve">Next, press the escape button and then type </w:t>
-      </w:r>
-      <w:proofErr w:type="gramStart"/>
-      <w:r>
-        <w:t>“:</w:t>
-      </w:r>
-      <w:proofErr w:type="spellStart"/>
-      <w:r>
-        <w:t>wq</w:t>
-      </w:r>
-      <w:proofErr w:type="spellEnd"/>
-      <w:proofErr w:type="gramEnd"/>
-      <w:r>
-        <w:t>” (w stands for write and q means to quit the editor.) to close this editor and a new editor will appear.</w:t>
-      </w:r>
-    </w:p>
-    <w:p>
-      <w:r>
+        <w:t>Next, press the escape button and then type “:wq” (w stands for write and q means to quit the editor.) to close this editor and a new editor will appear.</w:t>
+      </w:r>
+    </w:p>
+    <w:p>
+      <w:r>
+        <w:rPr>
+          <w:noProof/>
+        </w:rPr>
+        <w:lastRenderedPageBreak/>
         <w:drawing>
           <wp:inline distT="0" distB="0" distL="0" distR="0" wp14:anchorId="03FCA8A9" wp14:editId="0EDF0C53">
             <wp:extent cx="4934639" cy="2553056"/>
@@ -927,26 +891,15 @@
         <w:t>see the commit messages of all the commits that you are squashing. You can delete everything regarding commit messages and add a new commit message or keep one of the old ones. In this case, I wrote a new commit message.</w:t>
       </w:r>
       <w:r>
-        <w:t xml:space="preserve"> When you are finished, press the escape button again and type </w:t>
-      </w:r>
-      <w:proofErr w:type="gramStart"/>
-      <w:r>
-        <w:t>“:</w:t>
-      </w:r>
-      <w:proofErr w:type="spellStart"/>
-      <w:r>
-        <w:t>wq</w:t>
-      </w:r>
-      <w:proofErr w:type="spellEnd"/>
-      <w:proofErr w:type="gramEnd"/>
-      <w:r>
-        <w:t>” again to write and quit the editor.</w:t>
+        <w:t xml:space="preserve"> When you are finished, press the escape button again and type “:wq” again to write and quit the editor.</w:t>
       </w:r>
     </w:p>
     <w:p/>
     <w:p>
       <w:r>
-        <w:lastRenderedPageBreak/>
+        <w:rPr>
+          <w:noProof/>
+        </w:rPr>
         <w:drawing>
           <wp:inline distT="0" distB="0" distL="0" distR="0" wp14:anchorId="2FFDBF8D" wp14:editId="3BEF2B04">
             <wp:extent cx="4232366" cy="2145574"/>
@@ -1008,80 +961,22 @@
         <w:t xml:space="preserve"> </w:t>
       </w:r>
       <w:r>
-        <w:t>git rebase -</w:t>
-      </w:r>
-      <w:proofErr w:type="spellStart"/>
-      <w:r>
-        <w:t>i</w:t>
-      </w:r>
-      <w:proofErr w:type="spellEnd"/>
-      <w:r>
-        <w:t xml:space="preserve"> HEAD</w:t>
-      </w:r>
-      <w:proofErr w:type="gramStart"/>
-      <w:r>
-        <w:t>~{</w:t>
-      </w:r>
-      <w:proofErr w:type="gramEnd"/>
-      <w:r>
-        <w:t xml:space="preserve">number of commits </w:t>
-      </w:r>
-      <w:r>
-        <w:t xml:space="preserve">to </w:t>
-      </w:r>
-      <w:proofErr w:type="gramStart"/>
-      <w:r>
-        <w:t>reorder</w:t>
-      </w:r>
-      <w:r>
-        <w:t>}</w:t>
-      </w:r>
-      <w:r>
-        <w:t>`</w:t>
-      </w:r>
-      <w:proofErr w:type="gramEnd"/>
-      <w:r>
-        <w:t xml:space="preserve">. </w:t>
-      </w:r>
-      <w:r>
-        <w:t xml:space="preserve">To reorder commits, you would just move the content from one line that is below another to a new position above. Since Git executes from top to bottom, any commit above another will appear first in commit history. </w:t>
-      </w:r>
-      <w:r>
-        <w:t xml:space="preserve">To exit the editor, press escape and type </w:t>
-      </w:r>
-      <w:proofErr w:type="gramStart"/>
-      <w:r>
-        <w:t>“:</w:t>
-      </w:r>
-      <w:proofErr w:type="spellStart"/>
-      <w:r>
-        <w:t>wq</w:t>
-      </w:r>
-      <w:proofErr w:type="spellEnd"/>
-      <w:proofErr w:type="gramEnd"/>
-      <w:r>
-        <w:t>” to write and quit.</w:t>
-      </w:r>
-    </w:p>
-    <w:p>
-      <w:r>
-        <w:t xml:space="preserve">It is important to note that if you try reordering </w:t>
-      </w:r>
-      <w:proofErr w:type="gramStart"/>
-      <w:r>
-        <w:t>commits</w:t>
-      </w:r>
-      <w:proofErr w:type="gramEnd"/>
-      <w:r>
-        <w:t xml:space="preserve"> that affect the same line within a file and Git </w:t>
-      </w:r>
-      <w:proofErr w:type="gramStart"/>
-      <w:r>
-        <w:t>is not able to</w:t>
-      </w:r>
-      <w:proofErr w:type="gramEnd"/>
-      <w:r>
-        <w:t xml:space="preserve"> apply them cleanly, Git may encounter conflicts and pause the rebase until you resolve them.</w:t>
+        <w:t xml:space="preserve">git rebase -i HEAD~{number of commits to reorder}`. </w:t>
+      </w:r>
+      <w:r>
+        <w:t xml:space="preserve">To reorder commits, you would just move the content from one line that is below another to a new </w:t>
+      </w:r>
+      <w:r>
+        <w:lastRenderedPageBreak/>
+        <w:t xml:space="preserve">position above. Since Git executes from top to bottom, any commit above another will appear first in commit history. </w:t>
+      </w:r>
+      <w:r>
+        <w:t>To exit the editor, press escape and type “:wq” to write and quit.</w:t>
+      </w:r>
+    </w:p>
+    <w:p>
+      <w:r>
+        <w:t>It is important to note that if you try reordering commits that affect the same line within a file and Git is not able to apply them cleanly, Git may encounter conflicts and pause the rebase until you resolve them.</w:t>
       </w:r>
     </w:p>
     <w:p>
@@ -1094,28 +989,7 @@
     </w:p>
     <w:p>
       <w:r>
-        <w:t xml:space="preserve">Dropping commits can also be done through interactive rebasing. Dropping a commit just removes the commit from the commit history. The command </w:t>
-      </w:r>
-      <w:proofErr w:type="gramStart"/>
-      <w:r>
-        <w:t>still remains</w:t>
-      </w:r>
-      <w:proofErr w:type="gramEnd"/>
-      <w:r>
-        <w:t xml:space="preserve"> the same as both squashing and reordering. To drop a commit, replace the word in front of the commit you want to remove with the word “drop”. Then press the escape button and type </w:t>
-      </w:r>
-      <w:proofErr w:type="gramStart"/>
-      <w:r>
-        <w:t>“:</w:t>
-      </w:r>
-      <w:proofErr w:type="spellStart"/>
-      <w:r>
-        <w:t>wq</w:t>
-      </w:r>
-      <w:proofErr w:type="spellEnd"/>
-      <w:proofErr w:type="gramEnd"/>
-      <w:r>
-        <w:t>” to write and quit.</w:t>
+        <w:t>Dropping commits can also be done through interactive rebasing. Dropping a commit just removes the commit from the commit history. The command still remains the same as both squashing and reordering. To drop a commit, replace the word in front of the commit you want to remove with the word “drop”. Then press the escape button and type “:wq” to write and quit.</w:t>
       </w:r>
     </w:p>
     <w:p>
@@ -1128,19 +1002,7 @@
     </w:p>
     <w:p>
       <w:r>
-        <w:t xml:space="preserve">Resetting history is the process of moving a branch reference to point to a past commit in the commit history. For instance, if we want to reset the branch to an older commit that is 2 commits behind the most recent, we </w:t>
-      </w:r>
-      <w:proofErr w:type="gramStart"/>
-      <w:r>
-        <w:t>would</w:t>
-      </w:r>
-      <w:proofErr w:type="gramEnd"/>
-      <w:r>
-        <w:t xml:space="preserve"> use the command `git reset --hard HEAD~2`. </w:t>
-      </w:r>
-      <w:r>
-        <w:lastRenderedPageBreak/>
-        <w:t xml:space="preserve">If we had a repository history that looked like A </w:t>
+        <w:t xml:space="preserve">Resetting history is the process of moving a branch reference to point to a past commit in the commit history. For instance, if we want to reset the branch to an older commit that is 2 commits behind the most recent, we would use the command `git reset --hard HEAD~2`. If we had a repository history that looked like A </w:t>
       </w:r>
       <w:r>
         <w:sym w:font="Wingdings" w:char="F0DF"/>
@@ -1167,15 +1029,7 @@
         <w:t xml:space="preserve"> B. </w:t>
       </w:r>
       <w:r>
-        <w:t xml:space="preserve">Commits C and D are not permanently lost, but they are now unreachable from typical branch navigation techniques. If we wanted to recover them, we would have to use `git </w:t>
-      </w:r>
-      <w:proofErr w:type="spellStart"/>
-      <w:r>
-        <w:t>reflog</w:t>
-      </w:r>
-      <w:proofErr w:type="spellEnd"/>
-      <w:r>
-        <w:t>`. This command is covered in a previous guide.</w:t>
+        <w:t>Commits C and D are not permanently lost, but they are now unreachable from typical branch navigation techniques. If we wanted to recover them, we would have to use `git reflog`. This command is covered in a previous guide.</w:t>
       </w:r>
     </w:p>
     <w:p>
@@ -1212,28 +1066,12 @@
         <w:t>notices the repositories’ histories are not the same</w:t>
       </w:r>
       <w:r>
-        <w:t xml:space="preserve">. You have a new history, but your remote repository has </w:t>
-      </w:r>
-      <w:proofErr w:type="gramStart"/>
-      <w:r>
-        <w:t>the</w:t>
-      </w:r>
-      <w:proofErr w:type="gramEnd"/>
-      <w:r>
-        <w:t xml:space="preserve"> old history. If we choose to rewrite the remote repository after weighing the risks, how can we push our changes?</w:t>
-      </w:r>
-    </w:p>
-    <w:p>
-      <w:r>
-        <w:t xml:space="preserve">You can do this with the command `git push {remote} {branch} --force`. This tells Git that you are aware of the issue it is trying to raise, but that you want it to force the push anyway. Essentially, you are telling </w:t>
-      </w:r>
-      <w:proofErr w:type="gramStart"/>
-      <w:r>
-        <w:t>Git</w:t>
-      </w:r>
-      <w:proofErr w:type="gramEnd"/>
-      <w:r>
-        <w:t xml:space="preserve"> “Replace the remote repository’s history with mine.”</w:t>
+        <w:t>. You have a new history, but your remote repository has the old history. If we choose to rewrite the remote repository after weighing the risks, how can we push our changes?</w:t>
+      </w:r>
+    </w:p>
+    <w:p>
+      <w:r>
+        <w:t>You can do this with the command `git push {remote} {branch} --force`. This tells Git that you are aware of the issue it is trying to raise, but that you want it to force the push anyway. Essentially, you are telling Git “Replace the remote repository’s history with mine.”</w:t>
       </w:r>
     </w:p>
     <w:p>
@@ -1326,33 +1164,13 @@
         <w:t>T</w:t>
       </w:r>
       <w:r>
-        <w:t xml:space="preserve">he team </w:t>
-      </w:r>
-      <w:proofErr w:type="gramStart"/>
-      <w:r>
-        <w:t>member</w:t>
-      </w:r>
-      <w:proofErr w:type="gramEnd"/>
-      <w:r>
-        <w:t xml:space="preserve"> may still be able to recover their work by rebasing their changes onto the new history. But if we were </w:t>
+        <w:t xml:space="preserve">he team member may still be able to recover their work by rebasing their changes onto the new history. But if we were </w:t>
       </w:r>
       <w:r>
         <w:t>to</w:t>
       </w:r>
       <w:r>
-        <w:t xml:space="preserve"> </w:t>
-      </w:r>
-      <w:r>
-        <w:lastRenderedPageBreak/>
-        <w:t xml:space="preserve">drop Commit D rather than </w:t>
-      </w:r>
-      <w:proofErr w:type="gramStart"/>
-      <w:r>
-        <w:t>squashing</w:t>
-      </w:r>
-      <w:proofErr w:type="gramEnd"/>
-      <w:r>
-        <w:t xml:space="preserve"> it with Commit C, resolving the conflict becomes much more complicated</w:t>
+        <w:t xml:space="preserve"> drop Commit D rather than squashing it with Commit C, resolving the conflict becomes much more complicated</w:t>
       </w:r>
       <w:r>
         <w:t xml:space="preserve"> if the changes made in the new commit being added depended on the changes made in Commit D.</w:t>
@@ -1364,6 +1182,38 @@
           <w:bottom w:val="single" w:sz="12" w:space="1" w:color="auto"/>
         </w:pBdr>
       </w:pPr>
+    </w:p>
+    <w:p>
+      <w:pPr>
+        <w:pStyle w:val="Heading2"/>
+      </w:pPr>
+      <w:r>
+        <w:t>Force-with-lease</w:t>
+      </w:r>
+    </w:p>
+    <w:p>
+      <w:r>
+        <w:t>There is a safer option other than outright attempting to force push changes to the remote repository. We have the option to use the command `git push --force-with-lease {remote} {branch}`. What this command does is verify if the remote is still pointing to the same commit that your remote-tracking branch believes the remote should be pointing to. For example, assume your last `git fetch` command has your remote-tracking branch pointing to Commit D. Git will use force-with-lease to verify that the remote is still pointing to Commit D before attempting to force push.</w:t>
+      </w:r>
+    </w:p>
+    <w:p>
+      <w:r>
+        <w:t>If the remote has changed since the last `git fetch`, the force push will fail because Git will refuse to make the force push. This is intentionally designed to try and alleviate the chance of the issues we discussed in the previous section. This is what makes force-with-lease safer than the force push option.</w:t>
+      </w:r>
+    </w:p>
+    <w:p>
+      <w:r>
+        <w:t xml:space="preserve">However, if the remote has not changed since the last `git fetch`, Git will allow you to make the force push. This does not mean that nobody is using the commit you are </w:t>
+      </w:r>
+      <w:r>
+        <w:lastRenderedPageBreak/>
+        <w:t>changing in their current work, but it does eliminate the possibility of overwriting commits that another team member has already pushed to the remote since your last `git fetch`.</w:t>
+      </w:r>
+    </w:p>
+    <w:p>
+      <w:r>
+        <w:t>Whenever you are attempting to rewrite public history like this, it is preferred that you use force-with-lease over a normal force push, as this option has an additional safety check that can help prevent overwrites of someone else’s work.</w:t>
+      </w:r>
     </w:p>
     <w:p/>
     <w:sectPr>
@@ -2187,6 +2037,7 @@
   <w:style w:type="character" w:default="1" w:styleId="DefaultParagraphFont">
     <w:name w:val="Default Paragraph Font"/>
     <w:uiPriority w:val="1"/>
+    <w:semiHidden/>
     <w:unhideWhenUsed/>
   </w:style>
   <w:style w:type="table" w:default="1" w:styleId="TableNormal">

</xml_diff>